<commit_message>
add mHLEA, metadata, and minor adjustments
</commit_message>
<xml_diff>
--- a/output/tables/table_summary.docx
+++ b/output/tables/table_summary.docx
@@ -65,7 +65,7 @@
           <w:sz w:val="20"/>
           <w:color w:val="333333"/>
         </w:rPr>
-        <w:t xml:space="default">Stockholm, Sweden, 59.3°N, 18.1°E, TZ: Europe/Stockholm</w:t>
+        <w:t xml:space="default">Borås, Sweden, 57.7°N, 12.9°E, TZ: Europe/Stockholm</w:t>
       </w:r>
     </w:p>
     <w:tbl xmlns:w="http://schemas.openxmlformats.org/wordprocessingml/2006/main" xmlns:wp="http://schemas.openxmlformats.org/drawingml/2006/wordprocessingDrawing" xmlns:r="http://schemas.openxmlformats.org/officeDocument/2006/relationships" xmlns:w14="http://schemas.microsoft.com/office/word/2010/wordml">
@@ -589,7 +589,7 @@
                 <w:rFonts w:ascii="Calibri" w:hAnsi="Calibri"/>
                 <w:sz w:val="20"/>
               </w:rPr>
-              <w:t xml:space="default">&lt;strong&gt;16h 6m&lt;/strong&gt; (11h 12m - 21h 40m)</w:t>
+              <w:t xml:space="default">&lt;strong&gt;15h 44m&lt;/strong&gt; (11h 16m - 20h 32m)</w:t>
             </w:r>
           </w:p>
         </w:tc>

</xml_diff>